<commit_message>
Extend Client View audience filter to exercise-level insight/flag fields
The pilot audit on Elizabeth Poyner found a real gap: baselineNotes'
audience:'internal' filter had no exercise-level equivalent, so an
insight sub-line explaining Antagonist Rotation Rule build-rationale
("Antagonist rotation — brief push touch between pull sets...") leaked
straight into her client view.

Added insightAudience/flagAudience:'internal' on exercise objects,
threaded isClientView through buildDayContent()/exTable(), and marked
the one leaking exercise in Elizabeth Poyner's script. Confirmed via
direct extraction: the line is now absent from the client view and
still present in the trainer document. Documented the new fields and
the search-for-similar-instances guidance in CLAUDE.md, since any
Antagonist-Rotation-Rule-driven insight elsewhere in the roster is a
likely candidate for the same fix.
</commit_message>
<xml_diff>
--- a/clients/elizabeth_poyner/Elizabeth_Poyner_5Day_Training_Plan_Client_View.docx
+++ b/clients/elizabeth_poyner/Elizabeth_Poyner_5Day_Training_Plan_Client_View.docx
@@ -14931,19 +14931,6 @@
                 <w:szCs w:val="18"/>
               </w:rPr>
               <w:t xml:space="preserve">Wall Push-Up (Light Activation)</w:t>
-            </w:r>
-          </w:p>
-          <w:p>
-            <w:r>
-              <w:rPr>
-                <w:rFonts w:ascii="Arial" w:cs="Arial" w:eastAsia="Arial" w:hAnsi="Arial"/>
-                <w:i/>
-                <w:iCs/>
-                <w:color w:val="6B6B6B"/>
-                <w:sz w:val="14"/>
-                <w:szCs w:val="14"/>
-              </w:rPr>
-              <w:t xml:space="preserve">Antagonist rotation — brief push touch between pull sets, no CNS tax</w:t>
             </w:r>
           </w:p>
         </w:tc>

</xml_diff>